<commit_message>
Sync Docker deployment handover document
</commit_message>
<xml_diff>
--- a/docs/handover/COMPANY_DETECTOR_DOCKER_DEPLOYMENT_HANDOVER.docx
+++ b/docs/handover/COMPANY_DETECTOR_DOCKER_DEPLOYMENT_HANDOVER.docx
@@ -327,7 +327,55 @@
               <w:rPr>
                 <w:sz w:val="18"/>
               </w:rPr>
-              <w:t>Acceptance test</w:t>
+              <w:t>Pre-cutover test</w:t>
+            </w:r>
+          </w:p>
+        </w:tc>
+        <w:tc>
+          <w:tcPr>
+            <w:tcW w:type="dxa" w:w="7128"/>
+            <w:tcMar>
+              <w:top w:w="100" w:type="dxa"/>
+              <w:start w:w="120" w:type="dxa"/>
+              <w:bottom w:w="100" w:type="dxa"/>
+              <w:end w:w="120" w:type="dxa"/>
+            </w:tcMar>
+            <w:vAlign w:val="center"/>
+          </w:tcPr>
+          <w:p>
+            <w:pPr>
+              <w:spacing w:after="0"/>
+            </w:pPr>
+            <w:r>
+              <w:rPr>
+                <w:sz w:val="18"/>
+              </w:rPr>
+              <w:t>ops/docker/verify-precutover.sh</w:t>
+            </w:r>
+          </w:p>
+        </w:tc>
+      </w:tr>
+      <w:tr>
+        <w:tc>
+          <w:tcPr>
+            <w:tcW w:type="dxa" w:w="2376"/>
+            <w:tcMar>
+              <w:top w:w="100" w:type="dxa"/>
+              <w:start w:w="120" w:type="dxa"/>
+              <w:bottom w:w="100" w:type="dxa"/>
+              <w:end w:w="120" w:type="dxa"/>
+            </w:tcMar>
+            <w:vAlign w:val="center"/>
+          </w:tcPr>
+          <w:p>
+            <w:pPr>
+              <w:spacing w:after="0"/>
+            </w:pPr>
+            <w:r>
+              <w:rPr>
+                <w:sz w:val="18"/>
+              </w:rPr>
+              <w:t>Final acceptance</w:t>
             </w:r>
           </w:p>
         </w:tc>
@@ -840,7 +888,7 @@
               <w:rPr>
                 <w:sz w:val="18"/>
               </w:rPr>
-              <w:t>BRAVE_SEARCH_API_KEY / Google CSE</w:t>
+              <w:t>BRAVE_SEARCH_API_KEY</w:t>
             </w:r>
           </w:p>
         </w:tc>
@@ -863,7 +911,103 @@
               <w:rPr>
                 <w:sz w:val="18"/>
               </w:rPr>
-              <w:t>Optional search enrichment</w:t>
+              <w:t>Required for VPS-equivalent search quality</w:t>
+            </w:r>
+          </w:p>
+        </w:tc>
+      </w:tr>
+      <w:tr>
+        <w:tc>
+          <w:tcPr>
+            <w:tcW w:type="dxa" w:w="3816"/>
+            <w:tcMar>
+              <w:top w:w="100" w:type="dxa"/>
+              <w:start w:w="120" w:type="dxa"/>
+              <w:bottom w:w="100" w:type="dxa"/>
+              <w:end w:w="120" w:type="dxa"/>
+            </w:tcMar>
+            <w:vAlign w:val="center"/>
+          </w:tcPr>
+          <w:p>
+            <w:pPr>
+              <w:spacing w:after="0"/>
+            </w:pPr>
+            <w:r>
+              <w:rPr>
+                <w:sz w:val="18"/>
+              </w:rPr>
+              <w:t>DEEPSEEK_API_KEY / MINIMAX_API_KEY</w:t>
+            </w:r>
+          </w:p>
+        </w:tc>
+        <w:tc>
+          <w:tcPr>
+            <w:tcW w:type="dxa" w:w="5688"/>
+            <w:tcMar>
+              <w:top w:w="100" w:type="dxa"/>
+              <w:start w:w="120" w:type="dxa"/>
+              <w:bottom w:w="100" w:type="dxa"/>
+              <w:end w:w="120" w:type="dxa"/>
+            </w:tcMar>
+            <w:vAlign w:val="center"/>
+          </w:tcPr>
+          <w:p>
+            <w:pPr>
+              <w:spacing w:after="0"/>
+            </w:pPr>
+            <w:r>
+              <w:rPr>
+                <w:sz w:val="18"/>
+              </w:rPr>
+              <w:t>VPS-equivalent fallback providers</w:t>
+            </w:r>
+          </w:p>
+        </w:tc>
+      </w:tr>
+      <w:tr>
+        <w:tc>
+          <w:tcPr>
+            <w:tcW w:type="dxa" w:w="3816"/>
+            <w:tcMar>
+              <w:top w:w="100" w:type="dxa"/>
+              <w:start w:w="120" w:type="dxa"/>
+              <w:bottom w:w="100" w:type="dxa"/>
+              <w:end w:w="120" w:type="dxa"/>
+            </w:tcMar>
+            <w:vAlign w:val="center"/>
+          </w:tcPr>
+          <w:p>
+            <w:pPr>
+              <w:spacing w:after="0"/>
+            </w:pPr>
+            <w:r>
+              <w:rPr>
+                <w:sz w:val="18"/>
+              </w:rPr>
+              <w:t>Google CSE</w:t>
+            </w:r>
+          </w:p>
+        </w:tc>
+        <w:tc>
+          <w:tcPr>
+            <w:tcW w:type="dxa" w:w="5688"/>
+            <w:tcMar>
+              <w:top w:w="100" w:type="dxa"/>
+              <w:start w:w="120" w:type="dxa"/>
+              <w:bottom w:w="100" w:type="dxa"/>
+              <w:end w:w="120" w:type="dxa"/>
+            </w:tcMar>
+            <w:vAlign w:val="center"/>
+          </w:tcPr>
+          <w:p>
+            <w:pPr>
+              <w:spacing w:after="0"/>
+            </w:pPr>
+            <w:r>
+              <w:rPr>
+                <w:sz w:val="18"/>
+              </w:rPr>
+              <w:t>Optional search fallback</w:t>
             </w:r>
           </w:p>
         </w:tc>
@@ -873,6 +1017,24 @@
       <w:pPr>
         <w:spacing w:after="0"/>
       </w:pPr>
+    </w:p>
+    <w:p>
+      <w:pPr>
+        <w:pStyle w:val="Heading2"/>
+      </w:pPr>
+      <w:r>
+        <w:t>Telegram Setup and Test Rules</w:t>
+      </w:r>
+    </w:p>
+    <w:p>
+      <w:r>
+        <w:t>Install TELEGRAM_DEFAULT_BOT_TOKEN and REGISTER_WORKER_TELEGRAM_TO in the office server .env through a secure channel, then restart the worker. Do not store either value in Git or this document.</w:t>
+      </w:r>
+    </w:p>
+    <w:p>
+      <w:r>
+        <w:t>The old VPS remains active during pre-cutover verification. Before final acceptance or testing manual inbound chat, stop the old VPS Telegram gateway/poller; two pollers must never use the same bot token concurrently.</w:t>
+      </w:r>
     </w:p>
     <w:p>
       <w:pPr>
@@ -1042,12 +1204,12 @@
         <w:pStyle w:val="Heading1"/>
       </w:pPr>
       <w:r>
-        <w:t>7. Mandatory Acceptance Test</w:t>
+        <w:t>7. Mandatory Verification</w:t>
       </w:r>
     </w:p>
     <w:p>
       <w:r>
-        <w:t>Run the repository acceptance test from the project root:</w:t>
+        <w:t>While the VPS remains active and the office gateway remains stopped, run:</w:t>
       </w:r>
     </w:p>
     <w:p>
@@ -1061,12 +1223,40 @@
           <w:rFonts w:ascii="Courier New" w:hAnsi="Courier New"/>
           <w:sz w:val="17"/>
         </w:rPr>
+        <w:t>./ops/docker/verify-precutover.sh</w:t>
+        <w:br/>
+        <w:t>./ops/docker/verify-runtime-parity.sh</w:t>
+      </w:r>
+    </w:p>
+    <w:p>
+      <w:r>
+        <w:t>Pre-cutover verification must report PASS for Compose, required services, webhook, dashboard, deterministic processing, database persistence, Slack digest dry-run, and Docker runtime parity.</w:t>
+      </w:r>
+    </w:p>
+    <w:p>
+      <w:r>
+        <w:t>During the final cutover window, stop the VPS gateway first, start the office gateway, then run:</w:t>
+      </w:r>
+    </w:p>
+    <w:p>
+      <w:pPr>
+        <w:spacing w:before="60" w:after="140"/>
+        <w:ind w:left="317" w:right="173"/>
+        <w:shd w:fill="F3F4F6"/>
+      </w:pPr>
+      <w:r>
+        <w:rPr>
+          <w:rFonts w:ascii="Courier New" w:hAnsi="Courier New"/>
+          <w:sz w:val="17"/>
+        </w:rPr>
+        <w:t>docker compose up -d gateway</w:t>
+        <w:br/>
         <w:t>./ops/docker/verify-deployment.sh</w:t>
       </w:r>
     </w:p>
     <w:p>
       <w:r>
-        <w:t>The test must report PASS for Compose, required services, production secrets, webhook, dashboard, OpenClaw/model access, Slack digest dry-run, queue processing, and database persistence.</w:t>
+        <w:t>Final acceptance must report PASS for production secrets, OpenClaw/model access, full agent queue processing, database persistence, and outbound Telegram delivery.</w:t>
       </w:r>
     </w:p>
     <w:p>
@@ -1106,6 +1296,11 @@
       </w:r>
     </w:p>
     <w:p>
+      <w:r>
+        <w:t>Use a clearly named test identity so the office-server report is recognizable. Never run both Telegram gateways during final acceptance.</w:t>
+      </w:r>
+    </w:p>
+    <w:p>
       <w:pPr>
         <w:pStyle w:val="Heading1"/>
       </w:pPr>
@@ -1128,7 +1323,7 @@
         <w:spacing w:after="60"/>
       </w:pPr>
       <w:r>
-        <w:t>Run the mandatory acceptance test again.</w:t>
+        <w:t>Run pre-cutover verification while the office gateway remains stopped.</w:t>
       </w:r>
     </w:p>
     <w:p>
@@ -1137,7 +1332,16 @@
         <w:spacing w:after="60"/>
       </w:pPr>
       <w:r>
-        <w:t>Stop worker, webhook, and digest services on the old VPS.</w:t>
+        <w:t>Stop gateway, worker, webhook, and digest services on the old VPS.</w:t>
+      </w:r>
+    </w:p>
+    <w:p>
+      <w:pPr>
+        <w:pStyle w:val="ListNumber"/>
+        <w:spacing w:after="60"/>
+      </w:pPr>
+      <w:r>
+        <w:t>Start the office gateway and run the final deployment acceptance test.</w:t>
       </w:r>
     </w:p>
     <w:p>

</xml_diff>

<commit_message>
Document and isolate Google review monitor
</commit_message>
<xml_diff>
--- a/docs/handover/COMPANY_DETECTOR_DOCKER_DEPLOYMENT_HANDOVER.docx
+++ b/docs/handover/COMPANY_DETECTOR_DOCKER_DEPLOYMENT_HANDOVER.docx
@@ -1380,7 +1380,79 @@
         <w:pStyle w:val="Heading1"/>
       </w:pPr>
       <w:r>
-        <w:t>10. Sign-Off</w:t>
+        <w:t>10. Optional Google Review Monitor</w:t>
+      </w:r>
+    </w:p>
+    <w:p>
+      <w:r>
+        <w:t>The Google Review Monitor is part of the same repository and Docker image, but it is isolated from the company investigation flow. It does not use OpenClaw or an LLM, does not write investigation tables, and is disabled by default through the review-monitor Compose profile.</w:t>
+      </w:r>
+    </w:p>
+    <w:p>
+      <w:pPr>
+        <w:pStyle w:val="ListBullet"/>
+        <w:spacing w:after="60"/>
+      </w:pPr>
+      <w:r>
+        <w:t>Collect authenticated Google Maps review cards at 21:00 WIB.</w:t>
+      </w:r>
+    </w:p>
+    <w:p>
+      <w:pPr>
+        <w:pStyle w:val="ListBullet"/>
+        <w:spacing w:after="60"/>
+      </w:pPr>
+      <w:r>
+        <w:t>Filter and deduplicate ratings 1-3 in a dedicated state volume.</w:t>
+      </w:r>
+    </w:p>
+    <w:p>
+      <w:pPr>
+        <w:pStyle w:val="ListBullet"/>
+        <w:spacing w:after="60"/>
+      </w:pPr>
+      <w:r>
+        <w:t>Send a Telegram report at 09:00 WIB.</w:t>
+      </w:r>
+    </w:p>
+    <w:p>
+      <w:pPr>
+        <w:pStyle w:val="ListBullet"/>
+        <w:spacing w:after="60"/>
+      </w:pPr>
+      <w:r>
+        <w:t>Send a monitoring failure alert when crawl data is limited, stale, or unavailable; never report a false empty result.</w:t>
+      </w:r>
+    </w:p>
+    <w:p>
+      <w:r>
+        <w:t>Enable this optional profile only after an authorized Google Maps Playwright storage-state is installed through a secure channel and authenticated collection passes.</w:t>
+      </w:r>
+    </w:p>
+    <w:p>
+      <w:pPr>
+        <w:spacing w:before="60" w:after="140"/>
+        <w:ind w:left="317" w:right="173"/>
+        <w:shd w:fill="F3F4F6"/>
+      </w:pPr>
+      <w:r>
+        <w:rPr>
+          <w:rFonts w:ascii="Courier New" w:hAnsi="Courier New"/>
+          <w:sz w:val="17"/>
+        </w:rPr>
+        <w:t>export REVIEW_MONITOR_STORAGE_STATE_HOST=/secure/google-maps-storage-state.json</w:t>
+        <w:br/>
+        <w:t>docker compose --profile review-monitor -f compose.yml -f compose.review-monitor.yml run --rm review-monitor node review_monitor/monitor.js collect</w:t>
+        <w:br/>
+        <w:t>docker compose --profile review-monitor -f compose.yml -f compose.review-monitor.yml up -d review-monitor</w:t>
+      </w:r>
+    </w:p>
+    <w:p>
+      <w:pPr>
+        <w:pStyle w:val="Heading1"/>
+      </w:pPr>
+      <w:r>
+        <w:t>11. Sign-Off</w:t>
       </w:r>
     </w:p>
     <w:tbl>

</xml_diff>

<commit_message>
Prepare Google Business Profile review monitor
</commit_message>
<xml_diff>
--- a/docs/handover/COMPANY_DETECTOR_DOCKER_DEPLOYMENT_HANDOVER.docx
+++ b/docs/handover/COMPANY_DETECTOR_DOCKER_DEPLOYMENT_HANDOVER.docx
@@ -1394,7 +1394,7 @@
         <w:spacing w:after="60"/>
       </w:pPr>
       <w:r>
-        <w:t>Collect authenticated Google Maps review cards at 21:00 WIB.</w:t>
+        <w:t>Collect reviews through the official Google Business Profile API at 21:00 WIB.</w:t>
       </w:r>
     </w:p>
     <w:p>
@@ -1421,12 +1421,12 @@
         <w:spacing w:after="60"/>
       </w:pPr>
       <w:r>
-        <w:t>Send a monitoring failure alert when crawl data is limited, stale, or unavailable; never report a false empty result.</w:t>
+        <w:t>Send a monitoring failure alert when OAuth or API collection fails; never report a false empty result.</w:t>
       </w:r>
     </w:p>
     <w:p>
       <w:r>
-        <w:t>Enable this optional profile only after an authorized Google Maps Playwright storage-state is installed through a secure channel and authenticated collection passes.</w:t>
+        <w:t>Keep OAuth, account, location, and Telegram secrets in .env.review-monitor with mode 600. Enable this optional profile only after official API collection and Telegram preflight pass.</w:t>
       </w:r>
     </w:p>
     <w:p>
@@ -1440,11 +1440,15 @@
           <w:rFonts w:ascii="Courier New" w:hAnsi="Courier New"/>
           <w:sz w:val="17"/>
         </w:rPr>
-        <w:t>export REVIEW_MONITOR_STORAGE_STATE_HOST=/secure/google-maps-storage-state.json</w:t>
+        <w:t>cp .env.review-monitor.example .env.review-monitor</w:t>
         <w:br/>
-        <w:t>docker compose --profile review-monitor -f compose.yml -f compose.review-monitor.yml run --rm review-monitor node review_monitor/monitor.js collect</w:t>
+        <w:t>chmod 600 .env.review-monitor</w:t>
         <w:br/>
-        <w:t>docker compose --profile review-monitor -f compose.yml -f compose.review-monitor.yml up -d review-monitor</w:t>
+        <w:t># Fill real values securely, then verify:</w:t>
+        <w:br/>
+        <w:t>./ops/docker/verify-review-monitor.sh</w:t>
+        <w:br/>
+        <w:t>docker compose --profile review-monitor up -d review-monitor</w:t>
       </w:r>
     </w:p>
     <w:p>

</xml_diff>